<commit_message>
fix: bind benchmark claims to fixture evidence
</commit_message>
<xml_diff>
--- a/tests/fixtures/benchmark/sources/regulatory-table.docx
+++ b/tests/fixtures/benchmark/sources/regulatory-table.docx
@@ -5,6 +5,11 @@
     <w:p>
       <w:r>
         <w:t xml:space="preserve">合成监管要求表</w:t>
+      </w:r>
+    </w:p>
+    <w:p>
+      <w:r>
+        <w:t xml:space="preserve">第二条 示例机构不得虚构业务记录。</w:t>
       </w:r>
     </w:p>
     <w:tbl>

</xml_diff>